<commit_message>
Add market growth insights and figure to project proposal documentation
</commit_message>
<xml_diff>
--- a/Documentation/CSE23602 COURSE PROJECT PROPOSAL.docx
+++ b/Documentation/CSE23602 COURSE PROJECT PROPOSAL.docx
@@ -120,7 +120,6 @@
           <w:sz w:val="20"/>
         </w:rPr>
       </w:pPr>
-      <w:proofErr w:type="gramStart"/>
       <w:r>
         <w:rPr>
           <w:rFonts w:ascii="Times New Roman"/>
@@ -146,7 +145,6 @@
         </w:rPr>
         <w:t>A</w:t>
       </w:r>
-      <w:proofErr w:type="gramEnd"/>
       <w:r>
         <w:rPr>
           <w:rFonts w:ascii="Times New Roman"/>
@@ -411,7 +409,6 @@
         </w:rPr>
         <w:t xml:space="preserve"> </w:t>
       </w:r>
-      <w:proofErr w:type="spellStart"/>
       <w:r>
         <w:rPr>
           <w:rFonts w:ascii="Times New Roman"/>
@@ -420,7 +417,6 @@
         </w:rPr>
         <w:t>i</w:t>
       </w:r>
-      <w:proofErr w:type="spellEnd"/>
       <w:r>
         <w:rPr>
           <w:rFonts w:ascii="Times New Roman"/>
@@ -481,7 +477,6 @@
         </w:rPr>
         <w:t xml:space="preserve"> </w:t>
       </w:r>
-      <w:proofErr w:type="gramStart"/>
       <w:r>
         <w:rPr>
           <w:rFonts w:ascii="Times New Roman"/>
@@ -507,7 +502,6 @@
         </w:rPr>
         <w:t>,</w:t>
       </w:r>
-      <w:proofErr w:type="gramEnd"/>
       <w:r>
         <w:rPr>
           <w:rFonts w:ascii="Times New Roman"/>
@@ -551,7 +545,6 @@
         </w:rPr>
         <w:t xml:space="preserve"> </w:t>
       </w:r>
-      <w:proofErr w:type="spellStart"/>
       <w:r>
         <w:rPr>
           <w:rFonts w:ascii="Times New Roman"/>
@@ -560,7 +553,6 @@
         </w:rPr>
         <w:t>f</w:t>
       </w:r>
-      <w:proofErr w:type="spellEnd"/>
       <w:r>
         <w:rPr>
           <w:rFonts w:ascii="Times New Roman"/>
@@ -570,7 +562,6 @@
         </w:rPr>
         <w:t xml:space="preserve"> </w:t>
       </w:r>
-      <w:proofErr w:type="spellStart"/>
       <w:r>
         <w:rPr>
           <w:rFonts w:ascii="Times New Roman"/>
@@ -579,7 +570,6 @@
         </w:rPr>
         <w:t>i</w:t>
       </w:r>
-      <w:proofErr w:type="spellEnd"/>
       <w:r>
         <w:rPr>
           <w:rFonts w:ascii="Times New Roman"/>
@@ -606,7 +596,6 @@
         </w:rPr>
         <w:t xml:space="preserve"> </w:t>
       </w:r>
-      <w:proofErr w:type="spellStart"/>
       <w:r>
         <w:rPr>
           <w:rFonts w:ascii="Times New Roman"/>
@@ -615,7 +604,6 @@
         </w:rPr>
         <w:t>i</w:t>
       </w:r>
-      <w:proofErr w:type="spellEnd"/>
       <w:r>
         <w:rPr>
           <w:rFonts w:ascii="Times New Roman"/>
@@ -761,7 +749,6 @@
         </w:rPr>
         <w:t xml:space="preserve"> </w:t>
       </w:r>
-      <w:proofErr w:type="gramStart"/>
       <w:r>
         <w:rPr>
           <w:rFonts w:ascii="Times New Roman"/>
@@ -787,7 +774,6 @@
         </w:rPr>
         <w:t>,</w:t>
       </w:r>
-      <w:proofErr w:type="gramEnd"/>
       <w:r>
         <w:rPr>
           <w:rFonts w:ascii="Times New Roman"/>
@@ -916,8 +902,6 @@
         </w:rPr>
         <w:t xml:space="preserve"> </w:t>
       </w:r>
-      <w:proofErr w:type="spellStart"/>
-      <w:proofErr w:type="gramStart"/>
       <w:r>
         <w:rPr>
           <w:rFonts w:ascii="Times New Roman"/>
@@ -926,7 +910,6 @@
         </w:rPr>
         <w:t>i</w:t>
       </w:r>
-      <w:proofErr w:type="spellEnd"/>
       <w:r>
         <w:rPr>
           <w:rFonts w:ascii="Times New Roman"/>
@@ -945,7 +928,6 @@
         </w:rPr>
         <w:t>)</w:t>
       </w:r>
-      <w:proofErr w:type="gramEnd"/>
     </w:p>
     <w:p>
       <w:pPr>
@@ -971,11 +953,9 @@
         </w:rPr>
         <w:t xml:space="preserve"> </w:t>
       </w:r>
-      <w:proofErr w:type="spellStart"/>
       <w:r>
         <w:t>i</w:t>
       </w:r>
-      <w:proofErr w:type="spellEnd"/>
       <w:r>
         <w:rPr>
           <w:spacing w:val="-11"/>
@@ -1054,7 +1034,6 @@
         </w:rPr>
         <w:t xml:space="preserve"> </w:t>
       </w:r>
-      <w:proofErr w:type="gramStart"/>
       <w:r>
         <w:t>t</w:t>
       </w:r>
@@ -1067,7 +1046,6 @@
       <w:r>
         <w:t>,</w:t>
       </w:r>
-      <w:proofErr w:type="gramEnd"/>
       <w:r>
         <w:rPr>
           <w:spacing w:val="60"/>
@@ -1191,11 +1169,9 @@
         </w:rPr>
         <w:t xml:space="preserve"> </w:t>
       </w:r>
-      <w:proofErr w:type="spellStart"/>
       <w:r>
         <w:t>i</w:t>
       </w:r>
-      <w:proofErr w:type="spellEnd"/>
       <w:r>
         <w:rPr>
           <w:spacing w:val="60"/>
@@ -1238,7 +1214,6 @@
         </w:rPr>
         <w:t xml:space="preserve"> </w:t>
       </w:r>
-      <w:proofErr w:type="gramStart"/>
       <w:r>
         <w:t>r</w:t>
       </w:r>
@@ -1251,7 +1226,6 @@
       <w:r>
         <w:t>,</w:t>
       </w:r>
-      <w:proofErr w:type="gramEnd"/>
       <w:r>
         <w:rPr>
           <w:spacing w:val="59"/>
@@ -1330,7 +1304,6 @@
         </w:rPr>
         <w:t xml:space="preserve"> </w:t>
       </w:r>
-      <w:proofErr w:type="gramStart"/>
       <w:r>
         <w:t>u</w:t>
       </w:r>
@@ -1343,7 +1316,6 @@
       <w:r>
         <w:t>,</w:t>
       </w:r>
-      <w:proofErr w:type="gramEnd"/>
       <w:r>
         <w:rPr>
           <w:spacing w:val="59"/>
@@ -2077,7 +2049,6 @@
                 <w:sz w:val="24"/>
               </w:rPr>
             </w:pPr>
-            <w:proofErr w:type="gramStart"/>
             <w:r>
               <w:rPr>
                 <w:b/>
@@ -2086,7 +2057,6 @@
               </w:rPr>
               <w:t>BY:-</w:t>
             </w:r>
-            <w:proofErr w:type="gramEnd"/>
           </w:p>
         </w:tc>
         <w:tc>
@@ -2383,6 +2353,127 @@
               </w:rPr>
               <w:t>.</w:t>
             </w:r>
+            <w:r>
+              <w:t xml:space="preserve"> </w:t>
+            </w:r>
+            <w:r>
+              <w:rPr>
+                <w:rFonts w:ascii="Times New Roman" w:hAnsi="Times New Roman" w:cs="Times New Roman"/>
+                <w:w w:val="105"/>
+                <w:sz w:val="24"/>
+              </w:rPr>
+              <w:t>As illustrated in Figure 1, the India E-commerce Market report published by Grand View Research shows that the Indian e-commerce market is expected to grow at a CAGR of 19.6% from 2023 to 2030, with major contributions from consumer electronics, clothing, beauty products, and home applications, indicating rapid expansion of online retail and increasing opportunities for financial and machine learning-driven analytics in e-commerce systems</w:t>
+            </w:r>
+            <w:r>
+              <w:t>[11]</w:t>
+            </w:r>
+            <w:r>
+              <w:t>.</w:t>
+            </w:r>
+          </w:p>
+          <w:p>
+            <w:pPr>
+              <w:pStyle w:val="TableParagraph"/>
+              <w:spacing w:line="276" w:lineRule="auto"/>
+              <w:ind w:left="107"/>
+              <w:jc w:val="center"/>
+              <w:rPr>
+                <w:rFonts w:ascii="Times New Roman" w:hAnsi="Times New Roman" w:cs="Times New Roman"/>
+                <w:w w:val="105"/>
+                <w:sz w:val="24"/>
+              </w:rPr>
+            </w:pPr>
+            <w:r>
+              <w:rPr>
+                <w:rFonts w:ascii="Times New Roman" w:hAnsi="Times New Roman" w:cs="Times New Roman"/>
+                <w:noProof/>
+                <w:w w:val="105"/>
+                <w:sz w:val="24"/>
+              </w:rPr>
+              <w:drawing>
+                <wp:inline distT="0" distB="0" distL="0" distR="0" wp14:anchorId="7F8FD33D" wp14:editId="3F484073">
+                  <wp:extent cx="3445803" cy="1799863"/>
+                  <wp:effectExtent l="0" t="0" r="2540" b="0"/>
+                  <wp:docPr id="1672309516" name="Picture 2"/>
+                  <wp:cNvGraphicFramePr>
+                    <a:graphicFrameLocks xmlns:a="http://schemas.openxmlformats.org/drawingml/2006/main" noChangeAspect="1"/>
+                  </wp:cNvGraphicFramePr>
+                  <a:graphic xmlns:a="http://schemas.openxmlformats.org/drawingml/2006/main">
+                    <a:graphicData uri="http://schemas.openxmlformats.org/drawingml/2006/picture">
+                      <pic:pic xmlns:pic="http://schemas.openxmlformats.org/drawingml/2006/picture">
+                        <pic:nvPicPr>
+                          <pic:cNvPr id="1672309516" name="Picture 1672309516"/>
+                          <pic:cNvPicPr/>
+                        </pic:nvPicPr>
+                        <pic:blipFill>
+                          <a:blip r:embed="rId6">
+                            <a:extLst>
+                              <a:ext uri="{28A0092B-C50C-407E-A947-70E740481C1C}">
+                                <a14:useLocalDpi xmlns:a14="http://schemas.microsoft.com/office/drawing/2010/main" val="0"/>
+                              </a:ext>
+                            </a:extLst>
+                          </a:blip>
+                          <a:stretch>
+                            <a:fillRect/>
+                          </a:stretch>
+                        </pic:blipFill>
+                        <pic:spPr>
+                          <a:xfrm>
+                            <a:off x="0" y="0"/>
+                            <a:ext cx="3485875" cy="1820794"/>
+                          </a:xfrm>
+                          <a:prstGeom prst="rect">
+                            <a:avLst/>
+                          </a:prstGeom>
+                        </pic:spPr>
+                      </pic:pic>
+                    </a:graphicData>
+                  </a:graphic>
+                </wp:inline>
+              </w:drawing>
+            </w:r>
+          </w:p>
+          <w:p>
+            <w:pPr>
+              <w:pStyle w:val="TableParagraph"/>
+              <w:tabs>
+                <w:tab w:val="left" w:pos="2278"/>
+              </w:tabs>
+              <w:jc w:val="center"/>
+              <w:rPr>
+                <w:w w:val="105"/>
+                <w:sz w:val="18"/>
+                <w:szCs w:val="18"/>
+                <w:lang w:val="en-IN"/>
+              </w:rPr>
+            </w:pPr>
+            <w:r>
+              <w:rPr>
+                <w:w w:val="105"/>
+                <w:sz w:val="18"/>
+                <w:szCs w:val="18"/>
+                <w:lang w:val="en-IN"/>
+              </w:rPr>
+              <w:t>Fig</w:t>
+            </w:r>
+            <w:r>
+              <w:rPr>
+                <w:w w:val="105"/>
+                <w:sz w:val="18"/>
+                <w:szCs w:val="18"/>
+                <w:lang w:val="en-IN"/>
+              </w:rPr>
+              <w:t>ure</w:t>
+            </w:r>
+            <w:r>
+              <w:rPr>
+                <w:w w:val="105"/>
+                <w:sz w:val="18"/>
+                <w:szCs w:val="18"/>
+                <w:lang w:val="en-IN"/>
+              </w:rPr>
+              <w:t>. 1. India E-Commerce Market Size by Application (2020–2030)</w:t>
+            </w:r>
           </w:p>
           <w:p>
             <w:pPr>
@@ -2400,7 +2491,15 @@
                 <w:rFonts w:ascii="Times New Roman" w:hAnsi="Times New Roman" w:cs="Times New Roman"/>
                 <w:sz w:val="24"/>
               </w:rPr>
-              <w:t>To address these challenges, machine learning models such as Linear Regression and Support Vector Machine (SVM) are widely used for demand forecasting. Linear Regression is a simple yet effective statistical method that models the relationship between dependent and independent variables, making it suitable for identifying linear trends in sales data. It is computationally efficient and easy to interpret, which makes it a strong baseline model. However, it struggles with complex and non-linear patterns. On the other hand, Support Vector Machine (SVM) is a powerful supervised learning algorithm capable of handling both linear and non-linear data using kernel functions. SVM works by finding an optimal hyperplane that minimizes prediction error while maximizing generalization. It performs well in high-dimensional datasets and is less prone to overfitting. Compared to Linear Regression, SVM provides better accuracy in capturing complex demand patterns, making it suitable for real-world e-commerce scenarios</w:t>
+              <w:t xml:space="preserve">To address these challenges, machine learning models such as Linear Regression and Support Vector Machine (SVM) are widely used for demand forecasting. Linear Regression is a simple yet effective statistical method that models the relationship between dependent </w:t>
+            </w:r>
+            <w:r>
+              <w:rPr>
+                <w:rFonts w:ascii="Times New Roman" w:hAnsi="Times New Roman" w:cs="Times New Roman"/>
+                <w:sz w:val="24"/>
+              </w:rPr>
+              <w:lastRenderedPageBreak/>
+              <w:t>and independent variables, making it suitable for identifying linear trends in sales data. It is computationally efficient and easy to interpret, which makes it a strong baseline model. However, it struggles with complex and non-linear patterns. On the other hand, Support Vector Machine (SVM) is a powerful supervised learning algorithm capable of handling both linear and non-linear data using kernel functions. SVM works by finding an optimal hyperplane that minimizes prediction error while maximizing generalization. It performs well in high-dimensional datasets and is less prone to overfitting. Compared to Linear Regression, SVM provides better accuracy in capturing complex demand patterns, making it suitable for real-world e-commerce scenarios</w:t>
             </w:r>
             <w:r>
               <w:rPr>
@@ -2526,47 +2625,7 @@
                 <w:sz w:val="24"/>
                 <w:lang w:val="en-IN"/>
               </w:rPr>
-              <w:t xml:space="preserve">To overcome these limitations, machine learning techniques have been introduced in demand forecasting systems. Models such as Decision Trees, K-Nearest </w:t>
-            </w:r>
-            <w:proofErr w:type="spellStart"/>
-            <w:r>
-              <w:rPr>
-                <w:rFonts w:ascii="Times New Roman" w:hAnsi="Times New Roman" w:cs="Times New Roman"/>
-                <w:w w:val="105"/>
-                <w:sz w:val="24"/>
-                <w:lang w:val="en-IN"/>
-              </w:rPr>
-              <w:t>Neighbors</w:t>
-            </w:r>
-            <w:proofErr w:type="spellEnd"/>
-            <w:r>
-              <w:rPr>
-                <w:rFonts w:ascii="Times New Roman" w:hAnsi="Times New Roman" w:cs="Times New Roman"/>
-                <w:w w:val="105"/>
-                <w:sz w:val="24"/>
-                <w:lang w:val="en-IN"/>
-              </w:rPr>
-              <w:t xml:space="preserve">, and Random Forests are used to capture non-linear relationships in large datasets. These models improve prediction accuracy by learning from multiple features, including pricing, seasonality, and customer </w:t>
-            </w:r>
-            <w:proofErr w:type="spellStart"/>
-            <w:r>
-              <w:rPr>
-                <w:rFonts w:ascii="Times New Roman" w:hAnsi="Times New Roman" w:cs="Times New Roman"/>
-                <w:w w:val="105"/>
-                <w:sz w:val="24"/>
-                <w:lang w:val="en-IN"/>
-              </w:rPr>
-              <w:t>behavior</w:t>
-            </w:r>
-            <w:proofErr w:type="spellEnd"/>
-            <w:r>
-              <w:rPr>
-                <w:rFonts w:ascii="Times New Roman" w:hAnsi="Times New Roman" w:cs="Times New Roman"/>
-                <w:w w:val="105"/>
-                <w:sz w:val="24"/>
-                <w:lang w:val="en-IN"/>
-              </w:rPr>
-              <w:t>. However, they often require extensive feature engineering and large datasets for optimal performance. Additionally, some models like KNN suffer from high computational cost, while Decision Trees may lead to overfitting. Although ensemble methods such as Random Forest and Gradient Boosting improve performance, they increase model complexity and reduce interpretability, making them difficult to deploy in real-time financial systems.</w:t>
+              <w:t>To overcome these limitations, machine learning techniques have been introduced in demand forecasting systems. Models such as Decision Trees, K-Nearest Neighbors, and Random Forests are used to capture non-linear relationships in large datasets. These models improve prediction accuracy by learning from multiple features, including pricing, seasonality, and customer behavior. However, they often require extensive feature engineering and large datasets for optimal performance. Additionally, some models like KNN suffer from high computational cost, while Decision Trees may lead to overfitting. Although ensemble methods such as Random Forest and Gradient Boosting improve performance, they increase model complexity and reduce interpretability, making them difficult to deploy in real-time financial systems.</w:t>
             </w:r>
           </w:p>
           <w:p>
@@ -2794,199 +2853,7 @@
                 <w:rFonts w:ascii="Times New Roman" w:hAnsi="Times New Roman" w:cs="Times New Roman"/>
                 <w:sz w:val="24"/>
               </w:rPr>
-              <w:t xml:space="preserve">The proposed system aims to predict market demand in the e-commerce domain using machine learning techniques. The study utilizes a synthetic Indian e-commerce dataset spanning 36 months, containing 30,600 records and 16 features such as </w:t>
-            </w:r>
-            <w:proofErr w:type="spellStart"/>
-            <w:r>
-              <w:rPr>
-                <w:rFonts w:ascii="Times New Roman" w:hAnsi="Times New Roman" w:cs="Times New Roman"/>
-                <w:sz w:val="24"/>
-              </w:rPr>
-              <w:t>order_date</w:t>
-            </w:r>
-            <w:proofErr w:type="spellEnd"/>
-            <w:r>
-              <w:rPr>
-                <w:rFonts w:ascii="Times New Roman" w:hAnsi="Times New Roman" w:cs="Times New Roman"/>
-                <w:sz w:val="24"/>
-              </w:rPr>
-              <w:t xml:space="preserve">, zone, </w:t>
-            </w:r>
-            <w:proofErr w:type="gramStart"/>
-            <w:r>
-              <w:rPr>
-                <w:rFonts w:ascii="Times New Roman" w:hAnsi="Times New Roman" w:cs="Times New Roman"/>
-                <w:sz w:val="24"/>
-              </w:rPr>
-              <w:t>category,brand</w:t>
-            </w:r>
-            <w:proofErr w:type="gramEnd"/>
-            <w:r>
-              <w:rPr>
-                <w:rFonts w:ascii="Times New Roman" w:hAnsi="Times New Roman" w:cs="Times New Roman"/>
-                <w:sz w:val="24"/>
-              </w:rPr>
-              <w:t>_</w:t>
-            </w:r>
-            <w:proofErr w:type="gramStart"/>
-            <w:r>
-              <w:rPr>
-                <w:rFonts w:ascii="Times New Roman" w:hAnsi="Times New Roman" w:cs="Times New Roman"/>
-                <w:sz w:val="24"/>
-              </w:rPr>
-              <w:t>type,customer</w:t>
-            </w:r>
-            <w:proofErr w:type="gramEnd"/>
-            <w:r>
-              <w:rPr>
-                <w:rFonts w:ascii="Times New Roman" w:hAnsi="Times New Roman" w:cs="Times New Roman"/>
-                <w:sz w:val="24"/>
-              </w:rPr>
-              <w:t>_</w:t>
-            </w:r>
-            <w:proofErr w:type="gramStart"/>
-            <w:r>
-              <w:rPr>
-                <w:rFonts w:ascii="Times New Roman" w:hAnsi="Times New Roman" w:cs="Times New Roman"/>
-                <w:sz w:val="24"/>
-              </w:rPr>
-              <w:t>gender,customer</w:t>
-            </w:r>
-            <w:proofErr w:type="gramEnd"/>
-            <w:r>
-              <w:rPr>
-                <w:rFonts w:ascii="Times New Roman" w:hAnsi="Times New Roman" w:cs="Times New Roman"/>
-                <w:sz w:val="24"/>
-              </w:rPr>
-              <w:t>_</w:t>
-            </w:r>
-            <w:proofErr w:type="gramStart"/>
-            <w:r>
-              <w:rPr>
-                <w:rFonts w:ascii="Times New Roman" w:hAnsi="Times New Roman" w:cs="Times New Roman"/>
-                <w:sz w:val="24"/>
-              </w:rPr>
-              <w:t>age,base</w:t>
-            </w:r>
-            <w:proofErr w:type="gramEnd"/>
-            <w:r>
-              <w:rPr>
-                <w:rFonts w:ascii="Times New Roman" w:hAnsi="Times New Roman" w:cs="Times New Roman"/>
-                <w:sz w:val="24"/>
-              </w:rPr>
-              <w:t>_</w:t>
-            </w:r>
-            <w:proofErr w:type="gramStart"/>
-            <w:r>
-              <w:rPr>
-                <w:rFonts w:ascii="Times New Roman" w:hAnsi="Times New Roman" w:cs="Times New Roman"/>
-                <w:sz w:val="24"/>
-              </w:rPr>
-              <w:t>price,discount</w:t>
-            </w:r>
-            <w:proofErr w:type="gramEnd"/>
-            <w:r>
-              <w:rPr>
-                <w:rFonts w:ascii="Times New Roman" w:hAnsi="Times New Roman" w:cs="Times New Roman"/>
-                <w:sz w:val="24"/>
-              </w:rPr>
-              <w:t>_</w:t>
-            </w:r>
-            <w:proofErr w:type="gramStart"/>
-            <w:r>
-              <w:rPr>
-                <w:rFonts w:ascii="Times New Roman" w:hAnsi="Times New Roman" w:cs="Times New Roman"/>
-                <w:sz w:val="24"/>
-              </w:rPr>
-              <w:t>percent,final</w:t>
-            </w:r>
-            <w:proofErr w:type="gramEnd"/>
-            <w:r>
-              <w:rPr>
-                <w:rFonts w:ascii="Times New Roman" w:hAnsi="Times New Roman" w:cs="Times New Roman"/>
-                <w:sz w:val="24"/>
-              </w:rPr>
-              <w:t>_</w:t>
-            </w:r>
-            <w:proofErr w:type="gramStart"/>
-            <w:r>
-              <w:rPr>
-                <w:rFonts w:ascii="Times New Roman" w:hAnsi="Times New Roman" w:cs="Times New Roman"/>
-                <w:sz w:val="24"/>
-              </w:rPr>
-              <w:t>price,units</w:t>
-            </w:r>
-            <w:proofErr w:type="gramEnd"/>
-            <w:r>
-              <w:rPr>
-                <w:rFonts w:ascii="Times New Roman" w:hAnsi="Times New Roman" w:cs="Times New Roman"/>
-                <w:sz w:val="24"/>
-              </w:rPr>
-              <w:t>_</w:t>
-            </w:r>
-            <w:proofErr w:type="gramStart"/>
-            <w:r>
-              <w:rPr>
-                <w:rFonts w:ascii="Times New Roman" w:hAnsi="Times New Roman" w:cs="Times New Roman"/>
-                <w:sz w:val="24"/>
-              </w:rPr>
-              <w:t>sold,revenue</w:t>
-            </w:r>
-            <w:proofErr w:type="gramEnd"/>
-            <w:r>
-              <w:rPr>
-                <w:rFonts w:ascii="Times New Roman" w:hAnsi="Times New Roman" w:cs="Times New Roman"/>
-                <w:sz w:val="24"/>
-              </w:rPr>
-              <w:t>,sales_</w:t>
-            </w:r>
-            <w:proofErr w:type="gramStart"/>
-            <w:r>
-              <w:rPr>
-                <w:rFonts w:ascii="Times New Roman" w:hAnsi="Times New Roman" w:cs="Times New Roman"/>
-                <w:sz w:val="24"/>
-              </w:rPr>
-              <w:t>event,competition</w:t>
-            </w:r>
-            <w:proofErr w:type="gramEnd"/>
-            <w:r>
-              <w:rPr>
-                <w:rFonts w:ascii="Times New Roman" w:hAnsi="Times New Roman" w:cs="Times New Roman"/>
-                <w:sz w:val="24"/>
-              </w:rPr>
-              <w:t>_</w:t>
-            </w:r>
-            <w:proofErr w:type="gramStart"/>
-            <w:r>
-              <w:rPr>
-                <w:rFonts w:ascii="Times New Roman" w:hAnsi="Times New Roman" w:cs="Times New Roman"/>
-                <w:sz w:val="24"/>
-              </w:rPr>
-              <w:t>intensity,andinventory</w:t>
-            </w:r>
-            <w:proofErr w:type="gramEnd"/>
-            <w:r>
-              <w:rPr>
-                <w:rFonts w:ascii="Times New Roman" w:hAnsi="Times New Roman" w:cs="Times New Roman"/>
-                <w:sz w:val="24"/>
-              </w:rPr>
-              <w:t>_</w:t>
-            </w:r>
-            <w:proofErr w:type="gramStart"/>
-            <w:r>
-              <w:rPr>
-                <w:rFonts w:ascii="Times New Roman" w:hAnsi="Times New Roman" w:cs="Times New Roman"/>
-                <w:sz w:val="24"/>
-              </w:rPr>
-              <w:t>pressure.The</w:t>
-            </w:r>
-            <w:proofErr w:type="gramEnd"/>
-            <w:r>
-              <w:rPr>
-                <w:rFonts w:ascii="Times New Roman" w:hAnsi="Times New Roman" w:cs="Times New Roman"/>
-                <w:sz w:val="24"/>
-              </w:rPr>
-              <w:t xml:space="preserve"> dataset is assumed to have no missing values.</w:t>
+              <w:t>The proposed system aims to predict market demand in the e-commerce domain using machine learning techniques. The study utilizes a synthetic Indian e-commerce dataset spanning 36 months, containing 30,600 records and 16 features such as order_date, zone, category,brand_type,customer_gender,customer_age,base_price,discount_percent,final_price,units_sold,revenue,sales_event,competition_intensity,andinventory_pressure.The dataset is assumed to have no missing values.</w:t>
             </w:r>
           </w:p>
           <w:p>
@@ -3007,115 +2874,7 @@
                 <w:sz w:val="24"/>
                 <w:lang w:val="en-IN"/>
               </w:rPr>
-              <w:t xml:space="preserve">In the proposed approach, data preprocessing will be performed by encoding categorical variables such as zone, category, </w:t>
-            </w:r>
-            <w:proofErr w:type="spellStart"/>
-            <w:r>
-              <w:rPr>
-                <w:rFonts w:ascii="Times New Roman" w:hAnsi="Times New Roman" w:cs="Times New Roman"/>
-                <w:sz w:val="24"/>
-                <w:lang w:val="en-IN"/>
-              </w:rPr>
-              <w:t>brand_type</w:t>
-            </w:r>
-            <w:proofErr w:type="spellEnd"/>
-            <w:r>
-              <w:rPr>
-                <w:rFonts w:ascii="Times New Roman" w:hAnsi="Times New Roman" w:cs="Times New Roman"/>
-                <w:sz w:val="24"/>
-                <w:lang w:val="en-IN"/>
-              </w:rPr>
-              <w:t xml:space="preserve">, and </w:t>
-            </w:r>
-            <w:proofErr w:type="spellStart"/>
-            <w:r>
-              <w:rPr>
-                <w:rFonts w:ascii="Times New Roman" w:hAnsi="Times New Roman" w:cs="Times New Roman"/>
-                <w:sz w:val="24"/>
-                <w:lang w:val="en-IN"/>
-              </w:rPr>
-              <w:t>sales_event</w:t>
-            </w:r>
-            <w:proofErr w:type="spellEnd"/>
-            <w:r>
-              <w:rPr>
-                <w:rFonts w:ascii="Times New Roman" w:hAnsi="Times New Roman" w:cs="Times New Roman"/>
-                <w:sz w:val="24"/>
-                <w:lang w:val="en-IN"/>
-              </w:rPr>
-              <w:t xml:space="preserve"> using One-Hot Encoding. Numerical features including </w:t>
-            </w:r>
-            <w:proofErr w:type="spellStart"/>
-            <w:r>
-              <w:rPr>
-                <w:rFonts w:ascii="Times New Roman" w:hAnsi="Times New Roman" w:cs="Times New Roman"/>
-                <w:sz w:val="24"/>
-                <w:lang w:val="en-IN"/>
-              </w:rPr>
-              <w:t>base_price</w:t>
-            </w:r>
-            <w:proofErr w:type="spellEnd"/>
-            <w:r>
-              <w:rPr>
-                <w:rFonts w:ascii="Times New Roman" w:hAnsi="Times New Roman" w:cs="Times New Roman"/>
-                <w:sz w:val="24"/>
-                <w:lang w:val="en-IN"/>
-              </w:rPr>
-              <w:t xml:space="preserve">, </w:t>
-            </w:r>
-            <w:proofErr w:type="spellStart"/>
-            <w:r>
-              <w:rPr>
-                <w:rFonts w:ascii="Times New Roman" w:hAnsi="Times New Roman" w:cs="Times New Roman"/>
-                <w:sz w:val="24"/>
-                <w:lang w:val="en-IN"/>
-              </w:rPr>
-              <w:t>discount_percent</w:t>
-            </w:r>
-            <w:proofErr w:type="spellEnd"/>
-            <w:r>
-              <w:rPr>
-                <w:rFonts w:ascii="Times New Roman" w:hAnsi="Times New Roman" w:cs="Times New Roman"/>
-                <w:sz w:val="24"/>
-                <w:lang w:val="en-IN"/>
-              </w:rPr>
-              <w:t xml:space="preserve">, </w:t>
-            </w:r>
-            <w:proofErr w:type="spellStart"/>
-            <w:r>
-              <w:rPr>
-                <w:rFonts w:ascii="Times New Roman" w:hAnsi="Times New Roman" w:cs="Times New Roman"/>
-                <w:sz w:val="24"/>
-                <w:lang w:val="en-IN"/>
-              </w:rPr>
-              <w:t>final_price</w:t>
-            </w:r>
-            <w:proofErr w:type="spellEnd"/>
-            <w:r>
-              <w:rPr>
-                <w:rFonts w:ascii="Times New Roman" w:hAnsi="Times New Roman" w:cs="Times New Roman"/>
-                <w:sz w:val="24"/>
-                <w:lang w:val="en-IN"/>
-              </w:rPr>
-              <w:t xml:space="preserve">, and </w:t>
-            </w:r>
-            <w:proofErr w:type="spellStart"/>
-            <w:r>
-              <w:rPr>
-                <w:rFonts w:ascii="Times New Roman" w:hAnsi="Times New Roman" w:cs="Times New Roman"/>
-                <w:sz w:val="24"/>
-                <w:lang w:val="en-IN"/>
-              </w:rPr>
-              <w:t>customer_age</w:t>
-            </w:r>
-            <w:proofErr w:type="spellEnd"/>
-            <w:r>
-              <w:rPr>
-                <w:rFonts w:ascii="Times New Roman" w:hAnsi="Times New Roman" w:cs="Times New Roman"/>
-                <w:sz w:val="24"/>
-                <w:lang w:val="en-IN"/>
-              </w:rPr>
-              <w:t xml:space="preserve"> will be normalized to ensure uniform scaling. Relevant features influencing demand will be selected for model training.</w:t>
+              <w:t>In the proposed approach, data preprocessing will be performed by encoding categorical variables such as zone, category, brand_type, and sales_event using One-Hot Encoding. Numerical features including base_price, discount_percent, final_price, and customer_age will be normalized to ensure uniform scaling. Relevant features influencing demand will be selected for model training.</w:t>
             </w:r>
           </w:p>
           <w:p>
@@ -3157,25 +2916,7 @@
                 <w:sz w:val="24"/>
                 <w:lang w:val="en-IN"/>
               </w:rPr>
-              <w:t xml:space="preserve">Model performance will be evaluated using Mean Absolute Error (MAE), Mean Squared Error (MSE), and R² score. The system is expected to predict revenue or </w:t>
-            </w:r>
-            <w:proofErr w:type="spellStart"/>
-            <w:r>
-              <w:rPr>
-                <w:rFonts w:ascii="Times New Roman" w:hAnsi="Times New Roman" w:cs="Times New Roman"/>
-                <w:sz w:val="24"/>
-                <w:lang w:val="en-IN"/>
-              </w:rPr>
-              <w:t>units_sold</w:t>
-            </w:r>
-            <w:proofErr w:type="spellEnd"/>
-            <w:r>
-              <w:rPr>
-                <w:rFonts w:ascii="Times New Roman" w:hAnsi="Times New Roman" w:cs="Times New Roman"/>
-                <w:sz w:val="24"/>
-                <w:lang w:val="en-IN"/>
-              </w:rPr>
-              <w:t xml:space="preserve"> based on pricing and market conditions.</w:t>
+              <w:t>Model performance will be evaluated using Mean Absolute Error (MAE), Mean Squared Error (MSE), and R² score. The system is expected to predict revenue or units_sold based on pricing and market conditions.</w:t>
             </w:r>
           </w:p>
           <w:p>
@@ -3213,7 +2954,7 @@
                           <pic:cNvPicPr/>
                         </pic:nvPicPr>
                         <pic:blipFill>
-                          <a:blip r:embed="rId6" cstate="print">
+                          <a:blip r:embed="rId7" cstate="print">
                             <a:extLst>
                               <a:ext uri="{28A0092B-C50C-407E-A947-70E740481C1C}">
                                 <a14:useLocalDpi xmlns:a14="http://schemas.microsoft.com/office/drawing/2010/main" val="0"/>
@@ -3600,7 +3341,6 @@
               </w:rPr>
               <w:t xml:space="preserve">[7] </w:t>
             </w:r>
-            <w:proofErr w:type="spellStart"/>
             <w:r>
               <w:rPr>
                 <w:rFonts w:ascii="Times New Roman" w:hAnsi="Times New Roman" w:cs="Times New Roman"/>
@@ -3610,9 +3350,40 @@
                 <w:sz w:val="24"/>
                 <w:lang w:val="en-IN"/>
               </w:rPr>
-              <w:t>SmartMart</w:t>
-            </w:r>
-            <w:proofErr w:type="spellEnd"/>
+              <w:t>SmartMart – An Automated Shopping Mart with Blink and Facial Recognition for Payment</w:t>
+            </w:r>
+            <w:r>
+              <w:rPr>
+                <w:rFonts w:ascii="Times New Roman" w:hAnsi="Times New Roman" w:cs="Times New Roman"/>
+                <w:spacing w:val="-8"/>
+                <w:sz w:val="24"/>
+                <w:lang w:val="en-IN"/>
+              </w:rPr>
+              <w:t xml:space="preserve"> (2023)</w:t>
+            </w:r>
+          </w:p>
+          <w:p>
+            <w:pPr>
+              <w:pStyle w:val="TableParagraph"/>
+              <w:spacing w:line="276" w:lineRule="auto"/>
+              <w:ind w:left="107"/>
+              <w:jc w:val="both"/>
+              <w:rPr>
+                <w:rFonts w:ascii="Times New Roman" w:hAnsi="Times New Roman" w:cs="Times New Roman"/>
+                <w:spacing w:val="-8"/>
+                <w:sz w:val="24"/>
+                <w:lang w:val="en-IN"/>
+              </w:rPr>
+            </w:pPr>
+            <w:r>
+              <w:rPr>
+                <w:rFonts w:ascii="Times New Roman" w:hAnsi="Times New Roman" w:cs="Times New Roman"/>
+                <w:spacing w:val="-8"/>
+                <w:sz w:val="24"/>
+                <w:lang w:val="en-IN"/>
+              </w:rPr>
+              <w:t xml:space="preserve">[8] </w:t>
+            </w:r>
             <w:r>
               <w:rPr>
                 <w:rFonts w:ascii="Times New Roman" w:hAnsi="Times New Roman" w:cs="Times New Roman"/>
@@ -3622,7 +3393,7 @@
                 <w:sz w:val="24"/>
                 <w:lang w:val="en-IN"/>
               </w:rPr>
-              <w:t xml:space="preserve"> – An Automated Shopping Mart with Blink and Facial Recognition for Payment</w:t>
+              <w:t>Machine Learning for Demand Forecasting in Manufacturing</w:t>
             </w:r>
             <w:r>
               <w:rPr>
@@ -3654,7 +3425,7 @@
                 <w:sz w:val="24"/>
                 <w:lang w:val="en-IN"/>
               </w:rPr>
-              <w:t xml:space="preserve">[8] </w:t>
+              <w:t xml:space="preserve">[9] </w:t>
             </w:r>
             <w:r>
               <w:rPr>
@@ -3665,7 +3436,7 @@
                 <w:sz w:val="24"/>
                 <w:lang w:val="en-IN"/>
               </w:rPr>
-              <w:t>Machine Learning for Demand Forecasting in Manufacturing</w:t>
+              <w:t>Multivariate SVR Demand Forecasting for Beauty Products Based on Online Reviews</w:t>
             </w:r>
             <w:r>
               <w:rPr>
@@ -3697,7 +3468,7 @@
                 <w:sz w:val="24"/>
                 <w:lang w:val="en-IN"/>
               </w:rPr>
-              <w:t xml:space="preserve">[9] </w:t>
+              <w:t xml:space="preserve">[10] </w:t>
             </w:r>
             <w:r>
               <w:rPr>
@@ -3708,7 +3479,7 @@
                 <w:sz w:val="24"/>
                 <w:lang w:val="en-IN"/>
               </w:rPr>
-              <w:t>Multivariate SVR Demand Forecasting for Beauty Products Based on Online Reviews</w:t>
+              <w:t>A Hybrid Machine Learning Model for Demand Forecasting: Combination of K-Means, Elastic-Net, and Gaussian Process Regression</w:t>
             </w:r>
             <w:r>
               <w:rPr>
@@ -3740,7 +3511,18 @@
                 <w:sz w:val="24"/>
                 <w:lang w:val="en-IN"/>
               </w:rPr>
-              <w:t xml:space="preserve">[10] </w:t>
+              <w:t>[11]</w:t>
+            </w:r>
+            <w:r>
+              <w:t xml:space="preserve"> </w:t>
+            </w:r>
+            <w:r>
+              <w:rPr>
+                <w:rFonts w:ascii="Times New Roman" w:hAnsi="Times New Roman" w:cs="Times New Roman"/>
+                <w:spacing w:val="-8"/>
+                <w:sz w:val="24"/>
+              </w:rPr>
+              <w:t xml:space="preserve">Grand View Research, </w:t>
             </w:r>
             <w:r>
               <w:rPr>
@@ -3749,18 +3531,16 @@
                 <w:iCs/>
                 <w:spacing w:val="-8"/>
                 <w:sz w:val="24"/>
-                <w:lang w:val="en-IN"/>
-              </w:rPr>
-              <w:t>A Hybrid Machine Learning Model for Demand Forecasting: Combination of K-Means, Elastic-Net, and Gaussian Process Regression</w:t>
+              </w:rPr>
+              <w:t>India E-commerce Market Size, by Application, 2020–2030 (USD Billion)</w:t>
             </w:r>
             <w:r>
               <w:rPr>
                 <w:rFonts w:ascii="Times New Roman" w:hAnsi="Times New Roman" w:cs="Times New Roman"/>
                 <w:spacing w:val="-8"/>
                 <w:sz w:val="24"/>
-                <w:lang w:val="en-IN"/>
-              </w:rPr>
-              <w:t xml:space="preserve"> (2023)</w:t>
+              </w:rPr>
+              <w:t>, available at: Grand View Research</w:t>
             </w:r>
           </w:p>
         </w:tc>
@@ -4537,7 +4317,6 @@
   <w:style w:type="character" w:default="1" w:styleId="DefaultParagraphFont">
     <w:name w:val="Default Paragraph Font"/>
     <w:uiPriority w:val="1"/>
-    <w:semiHidden/>
     <w:unhideWhenUsed/>
   </w:style>
   <w:style w:type="table" w:default="1" w:styleId="TableNormal">
@@ -4606,6 +4385,19 @@
     <w:pPr>
       <w:spacing w:before="32"/>
     </w:pPr>
+  </w:style>
+  <w:style w:type="paragraph" w:styleId="NormalWeb">
+    <w:name w:val="Normal (Web)"/>
+    <w:basedOn w:val="Normal"/>
+    <w:uiPriority w:val="99"/>
+    <w:semiHidden/>
+    <w:unhideWhenUsed/>
+    <w:rsid w:val="002E1FA8"/>
+    <w:rPr>
+      <w:rFonts w:ascii="Times New Roman" w:hAnsi="Times New Roman" w:cs="Times New Roman"/>
+      <w:sz w:val="24"/>
+      <w:szCs w:val="24"/>
+    </w:rPr>
   </w:style>
 </w:styles>
 </file>

</xml_diff>